<commit_message>
docs(all): data plot in main-Docs updated with Conditional Joint Prob plot
</commit_message>
<xml_diff>
--- a/Docs/DataPlot-d3(exp2).docx
+++ b/Docs/DataPlot-d3(exp2).docx
@@ -285,10 +285,10 @@
           <wp:anchor behindDoc="0" distT="0" distB="0" distL="0" distR="0" simplePos="0" locked="0" layoutInCell="0" allowOverlap="1" relativeHeight="4">
             <wp:simplePos x="0" y="0"/>
             <wp:positionH relativeFrom="column">
-              <wp:align>center</wp:align>
+              <wp:posOffset>-107315</wp:posOffset>
             </wp:positionH>
             <wp:positionV relativeFrom="paragraph">
-              <wp:posOffset>635</wp:posOffset>
+              <wp:posOffset>90805</wp:posOffset>
             </wp:positionV>
             <wp:extent cx="6332220" cy="3977005"/>
             <wp:effectExtent l="0" t="0" r="0" b="0"/>
@@ -326,6 +326,231 @@
             </a:graphic>
           </wp:anchor>
         </w:drawing>
+      </w:r>
+    </w:p>
+    <w:p>
+      <w:pPr>
+        <w:pStyle w:val="Normal"/>
+        <w:bidi w:val="0"/>
+        <w:jc w:val="left"/>
+        <w:rPr/>
+      </w:pPr>
+      <w:r>
+        <w:rPr/>
+      </w:r>
+    </w:p>
+    <w:p>
+      <w:pPr>
+        <w:pStyle w:val="Normal"/>
+        <w:bidi w:val="0"/>
+        <w:jc w:val="left"/>
+        <w:rPr/>
+      </w:pPr>
+      <w:r>
+        <w:rPr/>
+      </w:r>
+    </w:p>
+    <w:p>
+      <w:pPr>
+        <w:pStyle w:val="Normal"/>
+        <w:bidi w:val="0"/>
+        <w:jc w:val="left"/>
+        <w:rPr/>
+      </w:pPr>
+      <w:r>
+        <w:rPr/>
+        <w:t>Joint prob plot:</w:t>
+      </w:r>
+    </w:p>
+    <w:p>
+      <w:pPr>
+        <w:pStyle w:val="Normal"/>
+        <w:bidi w:val="0"/>
+        <w:jc w:val="left"/>
+        <w:rPr/>
+      </w:pPr>
+      <w:r>
+        <w:rPr/>
+      </w:r>
+    </w:p>
+    <w:p>
+      <w:pPr>
+        <w:pStyle w:val="Normal"/>
+        <w:bidi w:val="0"/>
+        <w:jc w:val="left"/>
+        <w:rPr/>
+      </w:pPr>
+      <w:r>
+        <w:rPr/>
+        <w:t>1. avg joint conditional results of all separated by 2 groups</w:t>
+      </w:r>
+    </w:p>
+    <w:p>
+      <w:pPr>
+        <w:pStyle w:val="Normal"/>
+        <w:bidi w:val="0"/>
+        <w:jc w:val="left"/>
+        <w:rPr/>
+      </w:pPr>
+      <w:r>
+        <w:rPr/>
+        <w:drawing>
+          <wp:anchor behindDoc="0" distT="0" distB="0" distL="0" distR="0" simplePos="0" locked="0" layoutInCell="0" allowOverlap="1" relativeHeight="6">
+            <wp:simplePos x="0" y="0"/>
+            <wp:positionH relativeFrom="column">
+              <wp:align>center</wp:align>
+            </wp:positionH>
+            <wp:positionV relativeFrom="paragraph">
+              <wp:posOffset>635</wp:posOffset>
+            </wp:positionV>
+            <wp:extent cx="6332220" cy="1865630"/>
+            <wp:effectExtent l="0" t="0" r="0" b="0"/>
+            <wp:wrapSquare wrapText="largest"/>
+            <wp:docPr id="5" name="Image5" descr=""/>
+            <wp:cNvGraphicFramePr>
+              <a:graphicFrameLocks xmlns:a="http://schemas.openxmlformats.org/drawingml/2006/main" noChangeAspect="1"/>
+            </wp:cNvGraphicFramePr>
+            <a:graphic xmlns:a="http://schemas.openxmlformats.org/drawingml/2006/main">
+              <a:graphicData uri="http://schemas.openxmlformats.org/drawingml/2006/picture">
+                <pic:pic xmlns:pic="http://schemas.openxmlformats.org/drawingml/2006/picture">
+                  <pic:nvPicPr>
+                    <pic:cNvPr id="5" name="Image5" descr=""/>
+                    <pic:cNvPicPr>
+                      <a:picLocks noChangeAspect="1" noChangeArrowheads="1"/>
+                    </pic:cNvPicPr>
+                  </pic:nvPicPr>
+                  <pic:blipFill>
+                    <a:blip r:embed="rId6"/>
+                    <a:stretch>
+                      <a:fillRect/>
+                    </a:stretch>
+                  </pic:blipFill>
+                  <pic:spPr bwMode="auto">
+                    <a:xfrm>
+                      <a:off x="0" y="0"/>
+                      <a:ext cx="6332220" cy="1865630"/>
+                    </a:xfrm>
+                    <a:prstGeom prst="rect">
+                      <a:avLst/>
+                    </a:prstGeom>
+                  </pic:spPr>
+                </pic:pic>
+              </a:graphicData>
+            </a:graphic>
+          </wp:anchor>
+        </w:drawing>
+      </w:r>
+    </w:p>
+    <w:p>
+      <w:pPr>
+        <w:pStyle w:val="Normal"/>
+        <w:bidi w:val="0"/>
+        <w:jc w:val="left"/>
+        <w:rPr/>
+      </w:pPr>
+      <w:r>
+        <w:rPr/>
+      </w:r>
+    </w:p>
+    <w:p>
+      <w:pPr>
+        <w:pStyle w:val="Normal"/>
+        <w:bidi w:val="0"/>
+        <w:jc w:val="left"/>
+        <w:rPr/>
+      </w:pPr>
+      <w:r>
+        <w:rPr/>
+        <w:t>2. the above further separated by performance group high, midium, low</w:t>
+      </w:r>
+    </w:p>
+    <w:p>
+      <w:pPr>
+        <w:pStyle w:val="Normal"/>
+        <w:bidi w:val="0"/>
+        <w:jc w:val="left"/>
+        <w:rPr/>
+      </w:pPr>
+      <w:r>
+        <w:rPr/>
+        <w:drawing>
+          <wp:anchor behindDoc="0" distT="0" distB="0" distL="0" distR="0" simplePos="0" locked="0" layoutInCell="0" allowOverlap="1" relativeHeight="7">
+            <wp:simplePos x="0" y="0"/>
+            <wp:positionH relativeFrom="column">
+              <wp:align>center</wp:align>
+            </wp:positionH>
+            <wp:positionV relativeFrom="paragraph">
+              <wp:posOffset>635</wp:posOffset>
+            </wp:positionV>
+            <wp:extent cx="6332220" cy="4845050"/>
+            <wp:effectExtent l="0" t="0" r="0" b="0"/>
+            <wp:wrapSquare wrapText="largest"/>
+            <wp:docPr id="6" name="Image6" descr=""/>
+            <wp:cNvGraphicFramePr>
+              <a:graphicFrameLocks xmlns:a="http://schemas.openxmlformats.org/drawingml/2006/main" noChangeAspect="1"/>
+            </wp:cNvGraphicFramePr>
+            <a:graphic xmlns:a="http://schemas.openxmlformats.org/drawingml/2006/main">
+              <a:graphicData uri="http://schemas.openxmlformats.org/drawingml/2006/picture">
+                <pic:pic xmlns:pic="http://schemas.openxmlformats.org/drawingml/2006/picture">
+                  <pic:nvPicPr>
+                    <pic:cNvPr id="6" name="Image6" descr=""/>
+                    <pic:cNvPicPr>
+                      <a:picLocks noChangeAspect="1" noChangeArrowheads="1"/>
+                    </pic:cNvPicPr>
+                  </pic:nvPicPr>
+                  <pic:blipFill>
+                    <a:blip r:embed="rId7"/>
+                    <a:stretch>
+                      <a:fillRect/>
+                    </a:stretch>
+                  </pic:blipFill>
+                  <pic:spPr bwMode="auto">
+                    <a:xfrm>
+                      <a:off x="0" y="0"/>
+                      <a:ext cx="6332220" cy="4845050"/>
+                    </a:xfrm>
+                    <a:prstGeom prst="rect">
+                      <a:avLst/>
+                    </a:prstGeom>
+                  </pic:spPr>
+                </pic:pic>
+              </a:graphicData>
+            </a:graphic>
+          </wp:anchor>
+        </w:drawing>
+      </w:r>
+    </w:p>
+    <w:p>
+      <w:pPr>
+        <w:pStyle w:val="Normal"/>
+        <w:bidi w:val="0"/>
+        <w:jc w:val="left"/>
+        <w:rPr/>
+      </w:pPr>
+      <w:r>
+        <w:rPr/>
+      </w:r>
+    </w:p>
+    <w:p>
+      <w:pPr>
+        <w:pStyle w:val="Normal"/>
+        <w:bidi w:val="0"/>
+        <w:jc w:val="left"/>
+        <w:rPr/>
+      </w:pPr>
+      <w:r>
+        <w:rPr/>
+      </w:r>
+    </w:p>
+    <w:p>
+      <w:pPr>
+        <w:pStyle w:val="Normal"/>
+        <w:bidi w:val="0"/>
+        <w:jc w:val="left"/>
+        <w:rPr/>
+      </w:pPr>
+      <w:r>
+        <w:rPr/>
       </w:r>
     </w:p>
     <w:sectPr>

</xml_diff>

<commit_message>
docs(all): updates meeting log
</commit_message>
<xml_diff>
--- a/Docs/DataPlot-d3(exp2).docx
+++ b/Docs/DataPlot-d3(exp2).docx
@@ -1,6 +1,6 @@
 
 <file path=word/document.xml><?xml version="1.0" encoding="utf-8"?>
-<w:document xmlns:o="urn:schemas-microsoft-com:office:office" xmlns:r="http://schemas.openxmlformats.org/officeDocument/2006/relationships" xmlns:v="urn:schemas-microsoft-com:vml" xmlns:w="http://schemas.openxmlformats.org/wordprocessingml/2006/main" xmlns:w10="urn:schemas-microsoft-com:office:word" xmlns:wp="http://schemas.openxmlformats.org/drawingml/2006/wordprocessingDrawing" xmlns:wps="http://schemas.microsoft.com/office/word/2010/wordprocessingShape" xmlns:wpg="http://schemas.microsoft.com/office/word/2010/wordprocessingGroup" xmlns:mc="http://schemas.openxmlformats.org/markup-compatibility/2006" xmlns:wp14="http://schemas.microsoft.com/office/word/2010/wordprocessingDrawing" xmlns:w14="http://schemas.microsoft.com/office/word/2010/wordml" xmlns:w15="http://schemas.microsoft.com/office/word/2012/wordml" mc:Ignorable="w14 wp14 w15">
+<w:document xmlns:o="urn:schemas-microsoft-com:office:office" xmlns:r="http://schemas.openxmlformats.org/officeDocument/2006/relationships" xmlns:v="urn:schemas-microsoft-com:vml" xmlns:w="http://schemas.openxmlformats.org/wordprocessingml/2006/main" xmlns:w10="urn:schemas-microsoft-com:office:word" xmlns:wp="http://schemas.openxmlformats.org/drawingml/2006/wordprocessingDrawing" xmlns:pic="http://schemas.openxmlformats.org/drawingml/2006/picture" xmlns:wps="http://schemas.microsoft.com/office/word/2010/wordprocessingShape" xmlns:wpg="http://schemas.microsoft.com/office/word/2010/wordprocessingGroup" xmlns:mc="http://schemas.openxmlformats.org/markup-compatibility/2006" xmlns:wp14="http://schemas.microsoft.com/office/word/2010/wordprocessingDrawing" xmlns:w14="http://schemas.microsoft.com/office/word/2010/wordml" xmlns:w15="http://schemas.microsoft.com/office/word/2012/wordml" mc:Ignorable="w14 wp14 w15">
   <w:body>
     <w:p>
       <w:pPr>
@@ -62,6 +62,7 @@
                     <a:prstGeom prst="rect">
                       <a:avLst/>
                     </a:prstGeom>
+                    <a:noFill/>
                   </pic:spPr>
                 </pic:pic>
               </a:graphicData>
@@ -100,6 +101,7 @@
       <w:pPr>
         <w:pStyle w:val="Normal"/>
         <w:bidi w:val="0"/>
+        <w:spacing w:before="0" w:after="0"/>
         <w:jc w:val="left"/>
         <w:rPr/>
       </w:pPr>
@@ -156,6 +158,7 @@
                     <a:prstGeom prst="rect">
                       <a:avLst/>
                     </a:prstGeom>
+                    <a:noFill/>
                   </pic:spPr>
                 </pic:pic>
               </a:graphicData>
@@ -171,6 +174,7 @@
       <w:pPr>
         <w:pStyle w:val="Normal"/>
         <w:bidi w:val="0"/>
+        <w:spacing w:before="0" w:after="0"/>
         <w:jc w:val="left"/>
         <w:rPr/>
       </w:pPr>
@@ -211,7 +215,7 @@
       <w:r>
         <w:rPr/>
         <w:drawing>
-          <wp:anchor behindDoc="0" distT="0" distB="0" distL="0" distR="0" simplePos="0" locked="0" layoutInCell="0" allowOverlap="1" relativeHeight="2">
+          <wp:anchor behindDoc="0" distT="0" distB="0" distL="0" distR="18415" simplePos="0" locked="0" layoutInCell="0" allowOverlap="1" relativeHeight="2">
             <wp:simplePos x="0" y="0"/>
             <wp:positionH relativeFrom="column">
               <wp:align>center</wp:align>
@@ -249,6 +253,7 @@
                     <a:prstGeom prst="rect">
                       <a:avLst/>
                     </a:prstGeom>
+                    <a:noFill/>
                   </pic:spPr>
                 </pic:pic>
               </a:graphicData>
@@ -264,6 +269,7 @@
       <w:pPr>
         <w:pStyle w:val="Normal"/>
         <w:bidi w:val="0"/>
+        <w:spacing w:before="0" w:after="0"/>
         <w:jc w:val="left"/>
         <w:rPr/>
       </w:pPr>
@@ -320,6 +326,7 @@
                     <a:prstGeom prst="rect">
                       <a:avLst/>
                     </a:prstGeom>
+                    <a:noFill/>
                   </pic:spPr>
                 </pic:pic>
               </a:graphicData>
@@ -433,6 +440,7 @@
                     <a:prstGeom prst="rect">
                       <a:avLst/>
                     </a:prstGeom>
+                    <a:noFill/>
                   </pic:spPr>
                 </pic:pic>
               </a:graphicData>
@@ -512,6 +520,7 @@
                     <a:prstGeom prst="rect">
                       <a:avLst/>
                     </a:prstGeom>
+                    <a:noFill/>
                   </pic:spPr>
                 </pic:pic>
               </a:graphicData>
@@ -551,6 +560,63 @@
       </w:pPr>
       <w:r>
         <w:rPr/>
+      </w:r>
+    </w:p>
+    <w:p>
+      <w:pPr>
+        <w:pStyle w:val="Normal"/>
+        <w:bidi w:val="0"/>
+        <w:jc w:val="left"/>
+        <w:rPr/>
+      </w:pPr>
+      <w:r>
+        <w:rPr/>
+        <w:drawing>
+          <wp:anchor behindDoc="0" distT="0" distB="0" distL="0" distR="0" simplePos="0" locked="0" layoutInCell="0" allowOverlap="1" relativeHeight="8">
+            <wp:simplePos x="0" y="0"/>
+            <wp:positionH relativeFrom="column">
+              <wp:align>center</wp:align>
+            </wp:positionH>
+            <wp:positionV relativeFrom="paragraph">
+              <wp:posOffset>635</wp:posOffset>
+            </wp:positionV>
+            <wp:extent cx="6332220" cy="2477770"/>
+            <wp:effectExtent l="0" t="0" r="0" b="0"/>
+            <wp:wrapSquare wrapText="largest"/>
+            <wp:docPr id="7" name="Image7" descr=""/>
+            <wp:cNvGraphicFramePr>
+              <a:graphicFrameLocks xmlns:a="http://schemas.openxmlformats.org/drawingml/2006/main" noChangeAspect="1"/>
+            </wp:cNvGraphicFramePr>
+            <a:graphic xmlns:a="http://schemas.openxmlformats.org/drawingml/2006/main">
+              <a:graphicData uri="http://schemas.openxmlformats.org/drawingml/2006/picture">
+                <pic:pic xmlns:pic="http://schemas.openxmlformats.org/drawingml/2006/picture">
+                  <pic:nvPicPr>
+                    <pic:cNvPr id="7" name="Image7" descr=""/>
+                    <pic:cNvPicPr>
+                      <a:picLocks noChangeAspect="1" noChangeArrowheads="1"/>
+                    </pic:cNvPicPr>
+                  </pic:nvPicPr>
+                  <pic:blipFill>
+                    <a:blip r:embed="rId8"/>
+                    <a:stretch>
+                      <a:fillRect/>
+                    </a:stretch>
+                  </pic:blipFill>
+                  <pic:spPr bwMode="auto">
+                    <a:xfrm>
+                      <a:off x="0" y="0"/>
+                      <a:ext cx="6332220" cy="2477770"/>
+                    </a:xfrm>
+                    <a:prstGeom prst="rect">
+                      <a:avLst/>
+                    </a:prstGeom>
+                    <a:noFill/>
+                  </pic:spPr>
+                </pic:pic>
+              </a:graphicData>
+            </a:graphic>
+          </wp:anchor>
+        </w:drawing>
       </w:r>
     </w:p>
     <w:sectPr>
@@ -606,7 +672,7 @@
   <w:style w:type="paragraph" w:styleId="Heading">
     <w:name w:val="Heading"/>
     <w:basedOn w:val="Normal"/>
-    <w:next w:val="TextBody"/>
+    <w:next w:val="BodyText"/>
     <w:qFormat/>
     <w:pPr>
       <w:keepNext w:val="true"/>
@@ -618,7 +684,7 @@
       <w:szCs w:val="28"/>
     </w:rPr>
   </w:style>
-  <w:style w:type="paragraph" w:styleId="TextBody">
+  <w:style w:type="paragraph" w:styleId="BodyText">
     <w:name w:val="Body Text"/>
     <w:basedOn w:val="Normal"/>
     <w:pPr>
@@ -628,14 +694,14 @@
   </w:style>
   <w:style w:type="paragraph" w:styleId="List">
     <w:name w:val="List"/>
-    <w:basedOn w:val="TextBody"/>
+    <w:basedOn w:val="BodyText"/>
     <w:pPr/>
     <w:rPr>
       <w:rFonts w:cs="Lohit Devanagari"/>
     </w:rPr>
   </w:style>
   <w:style w:type="paragraph" w:styleId="Caption">
-    <w:name w:val="Caption"/>
+    <w:name w:val="caption"/>
     <w:basedOn w:val="Normal"/>
     <w:qFormat/>
     <w:pPr>
@@ -662,4 +728,110 @@
     </w:rPr>
   </w:style>
 </w:styles>
+</file>
+
+<file path=word/theme/theme1.xml><?xml version="1.0" encoding="utf-8"?>
+<a:theme xmlns:a="http://schemas.openxmlformats.org/drawingml/2006/main" xmlns:r="http://schemas.openxmlformats.org/officeDocument/2006/relationships" name="Office">
+  <a:themeElements>
+    <a:clrScheme name="LibreOffice">
+      <a:dk1>
+        <a:srgbClr val="000000"/>
+      </a:dk1>
+      <a:lt1>
+        <a:srgbClr val="ffffff"/>
+      </a:lt1>
+      <a:dk2>
+        <a:srgbClr val="000000"/>
+      </a:dk2>
+      <a:lt2>
+        <a:srgbClr val="ffffff"/>
+      </a:lt2>
+      <a:accent1>
+        <a:srgbClr val="18a303"/>
+      </a:accent1>
+      <a:accent2>
+        <a:srgbClr val="0369a3"/>
+      </a:accent2>
+      <a:accent3>
+        <a:srgbClr val="a33e03"/>
+      </a:accent3>
+      <a:accent4>
+        <a:srgbClr val="8e03a3"/>
+      </a:accent4>
+      <a:accent5>
+        <a:srgbClr val="c99c00"/>
+      </a:accent5>
+      <a:accent6>
+        <a:srgbClr val="c9211e"/>
+      </a:accent6>
+      <a:hlink>
+        <a:srgbClr val="0000ee"/>
+      </a:hlink>
+      <a:folHlink>
+        <a:srgbClr val="551a8b"/>
+      </a:folHlink>
+    </a:clrScheme>
+    <a:fontScheme name="Office">
+      <a:majorFont>
+        <a:latin typeface="Arial" pitchFamily="0" charset="1"/>
+        <a:ea typeface="DejaVu Sans" pitchFamily="0" charset="1"/>
+        <a:cs typeface="DejaVu Sans" pitchFamily="0" charset="1"/>
+      </a:majorFont>
+      <a:minorFont>
+        <a:latin typeface="Arial" pitchFamily="0" charset="1"/>
+        <a:ea typeface="DejaVu Sans" pitchFamily="0" charset="1"/>
+        <a:cs typeface="DejaVu Sans" pitchFamily="0" charset="1"/>
+      </a:minorFont>
+    </a:fontScheme>
+    <a:fmtScheme>
+      <a:fillStyleLst>
+        <a:solidFill>
+          <a:schemeClr val="phClr"/>
+        </a:solidFill>
+        <a:solidFill>
+          <a:schemeClr val="phClr"/>
+        </a:solidFill>
+        <a:solidFill>
+          <a:schemeClr val="phClr"/>
+        </a:solidFill>
+      </a:fillStyleLst>
+      <a:lnStyleLst>
+        <a:ln w="6350" cap="flat" cmpd="sng" algn="ctr">
+          <a:prstDash val="solid"/>
+          <a:miter/>
+        </a:ln>
+        <a:ln w="6350" cap="flat" cmpd="sng" algn="ctr">
+          <a:prstDash val="solid"/>
+          <a:miter/>
+        </a:ln>
+        <a:ln w="6350" cap="flat" cmpd="sng" algn="ctr">
+          <a:prstDash val="solid"/>
+          <a:miter/>
+        </a:ln>
+      </a:lnStyleLst>
+      <a:effectStyleLst>
+        <a:effectStyle>
+          <a:effectLst/>
+        </a:effectStyle>
+        <a:effectStyle>
+          <a:effectLst/>
+        </a:effectStyle>
+        <a:effectStyle>
+          <a:effectLst/>
+        </a:effectStyle>
+      </a:effectStyleLst>
+      <a:bgFillStyleLst>
+        <a:solidFill>
+          <a:schemeClr val="phClr"/>
+        </a:solidFill>
+        <a:solidFill>
+          <a:schemeClr val="phClr"/>
+        </a:solidFill>
+        <a:solidFill>
+          <a:schemeClr val="phClr"/>
+        </a:solidFill>
+      </a:bgFillStyleLst>
+    </a:fmtScheme>
+  </a:themeElements>
+</a:theme>
 </file>
</xml_diff>

<commit_message>
feat(model-e1): restore function change
- make trace add whenever strneghten as well
- strenghen trace by only replacing missing
</commit_message>
<xml_diff>
--- a/Docs/DataPlot-d3(exp2).docx
+++ b/Docs/DataPlot-d3(exp2).docx
@@ -213,7 +213,6 @@
         <w:rPr/>
       </w:pPr>
       <w:r>
-        <w:rPr/>
         <w:drawing>
           <wp:anchor behindDoc="0" distT="0" distB="0" distL="0" distR="18415" simplePos="0" locked="0" layoutInCell="0" allowOverlap="1" relativeHeight="2">
             <wp:simplePos x="0" y="0"/>
@@ -262,6 +261,90 @@
         </w:drawing>
       </w:r>
       <w:r>
+        <w:rPr/>
+        <w:t xml:space="preserve">Final within-list by initial </w:t>
+      </w:r>
+    </w:p>
+    <w:p>
+      <w:pPr>
+        <w:pStyle w:val="Normal"/>
+        <w:bidi w:val="0"/>
+        <w:jc w:val="left"/>
+        <w:rPr/>
+      </w:pPr>
+      <w:r>
+        <w:rPr/>
+        <w:t>Left: by initial study position, right: initial test position</w:t>
+      </w:r>
+    </w:p>
+    <w:p>
+      <w:pPr>
+        <w:pStyle w:val="Normal"/>
+        <w:bidi w:val="0"/>
+        <w:jc w:val="left"/>
+        <w:rPr/>
+      </w:pPr>
+      <w:r>
+        <w:rPr/>
+      </w:r>
+    </w:p>
+    <w:p>
+      <w:pPr>
+        <w:pStyle w:val="Normal"/>
+        <w:bidi w:val="0"/>
+        <w:jc w:val="left"/>
+        <w:rPr/>
+      </w:pPr>
+      <w:r>
+        <w:rPr/>
+        <w:drawing>
+          <wp:anchor behindDoc="0" distT="0" distB="0" distL="0" distR="0" simplePos="0" locked="0" layoutInCell="0" allowOverlap="1" relativeHeight="9">
+            <wp:simplePos x="0" y="0"/>
+            <wp:positionH relativeFrom="column">
+              <wp:align>center</wp:align>
+            </wp:positionH>
+            <wp:positionV relativeFrom="paragraph">
+              <wp:posOffset>635</wp:posOffset>
+            </wp:positionV>
+            <wp:extent cx="6332220" cy="2351405"/>
+            <wp:effectExtent l="0" t="0" r="0" b="0"/>
+            <wp:wrapSquare wrapText="largest"/>
+            <wp:docPr id="4" name="Image8" descr=""/>
+            <wp:cNvGraphicFramePr>
+              <a:graphicFrameLocks xmlns:a="http://schemas.openxmlformats.org/drawingml/2006/main" noChangeAspect="1"/>
+            </wp:cNvGraphicFramePr>
+            <a:graphic xmlns:a="http://schemas.openxmlformats.org/drawingml/2006/main">
+              <a:graphicData uri="http://schemas.openxmlformats.org/drawingml/2006/picture">
+                <pic:pic xmlns:pic="http://schemas.openxmlformats.org/drawingml/2006/picture">
+                  <pic:nvPicPr>
+                    <pic:cNvPr id="4" name="Image8" descr=""/>
+                    <pic:cNvPicPr>
+                      <a:picLocks noChangeAspect="1" noChangeArrowheads="1"/>
+                    </pic:cNvPicPr>
+                  </pic:nvPicPr>
+                  <pic:blipFill>
+                    <a:blip r:embed="rId5"/>
+                    <a:stretch>
+                      <a:fillRect/>
+                    </a:stretch>
+                  </pic:blipFill>
+                  <pic:spPr bwMode="auto">
+                    <a:xfrm>
+                      <a:off x="0" y="0"/>
+                      <a:ext cx="6332220" cy="2351405"/>
+                    </a:xfrm>
+                    <a:prstGeom prst="rect">
+                      <a:avLst/>
+                    </a:prstGeom>
+                    <a:noFill/>
+                  </pic:spPr>
+                </pic:pic>
+              </a:graphicData>
+            </a:graphic>
+          </wp:anchor>
+        </w:drawing>
+      </w:r>
+      <w:r>
         <w:br w:type="page"/>
       </w:r>
     </w:p>
@@ -299,7 +382,7 @@
             <wp:extent cx="6332220" cy="3977005"/>
             <wp:effectExtent l="0" t="0" r="0" b="0"/>
             <wp:wrapSquare wrapText="largest"/>
-            <wp:docPr id="4" name="Image3" descr=""/>
+            <wp:docPr id="5" name="Image3" descr=""/>
             <wp:cNvGraphicFramePr>
               <a:graphicFrameLocks xmlns:a="http://schemas.openxmlformats.org/drawingml/2006/main" noChangeAspect="1"/>
             </wp:cNvGraphicFramePr>
@@ -307,13 +390,13 @@
               <a:graphicData uri="http://schemas.openxmlformats.org/drawingml/2006/picture">
                 <pic:pic xmlns:pic="http://schemas.openxmlformats.org/drawingml/2006/picture">
                   <pic:nvPicPr>
-                    <pic:cNvPr id="4" name="Image3" descr=""/>
+                    <pic:cNvPr id="5" name="Image3" descr=""/>
                     <pic:cNvPicPr>
                       <a:picLocks noChangeAspect="1" noChangeArrowheads="1"/>
                     </pic:cNvPicPr>
                   </pic:nvPicPr>
                   <pic:blipFill>
-                    <a:blip r:embed="rId5"/>
+                    <a:blip r:embed="rId6"/>
                     <a:stretch>
                       <a:fillRect/>
                     </a:stretch>
@@ -413,7 +496,7 @@
             <wp:extent cx="6332220" cy="1865630"/>
             <wp:effectExtent l="0" t="0" r="0" b="0"/>
             <wp:wrapSquare wrapText="largest"/>
-            <wp:docPr id="5" name="Image5" descr=""/>
+            <wp:docPr id="6" name="Image5" descr=""/>
             <wp:cNvGraphicFramePr>
               <a:graphicFrameLocks xmlns:a="http://schemas.openxmlformats.org/drawingml/2006/main" noChangeAspect="1"/>
             </wp:cNvGraphicFramePr>
@@ -421,13 +504,13 @@
               <a:graphicData uri="http://schemas.openxmlformats.org/drawingml/2006/picture">
                 <pic:pic xmlns:pic="http://schemas.openxmlformats.org/drawingml/2006/picture">
                   <pic:nvPicPr>
-                    <pic:cNvPr id="5" name="Image5" descr=""/>
+                    <pic:cNvPr id="6" name="Image5" descr=""/>
                     <pic:cNvPicPr>
                       <a:picLocks noChangeAspect="1" noChangeArrowheads="1"/>
                     </pic:cNvPicPr>
                   </pic:nvPicPr>
                   <pic:blipFill>
-                    <a:blip r:embed="rId6"/>
+                    <a:blip r:embed="rId7"/>
                     <a:stretch>
                       <a:fillRect/>
                     </a:stretch>
@@ -493,7 +576,7 @@
             <wp:extent cx="6332220" cy="4845050"/>
             <wp:effectExtent l="0" t="0" r="0" b="0"/>
             <wp:wrapSquare wrapText="largest"/>
-            <wp:docPr id="6" name="Image6" descr=""/>
+            <wp:docPr id="7" name="Image6" descr=""/>
             <wp:cNvGraphicFramePr>
               <a:graphicFrameLocks xmlns:a="http://schemas.openxmlformats.org/drawingml/2006/main" noChangeAspect="1"/>
             </wp:cNvGraphicFramePr>
@@ -501,13 +584,13 @@
               <a:graphicData uri="http://schemas.openxmlformats.org/drawingml/2006/picture">
                 <pic:pic xmlns:pic="http://schemas.openxmlformats.org/drawingml/2006/picture">
                   <pic:nvPicPr>
-                    <pic:cNvPr id="6" name="Image6" descr=""/>
+                    <pic:cNvPr id="7" name="Image6" descr=""/>
                     <pic:cNvPicPr>
                       <a:picLocks noChangeAspect="1" noChangeArrowheads="1"/>
                     </pic:cNvPicPr>
                   </pic:nvPicPr>
                   <pic:blipFill>
-                    <a:blip r:embed="rId7"/>
+                    <a:blip r:embed="rId8"/>
                     <a:stretch>
                       <a:fillRect/>
                     </a:stretch>
@@ -583,7 +666,7 @@
             <wp:extent cx="6332220" cy="2477770"/>
             <wp:effectExtent l="0" t="0" r="0" b="0"/>
             <wp:wrapSquare wrapText="largest"/>
-            <wp:docPr id="7" name="Image7" descr=""/>
+            <wp:docPr id="8" name="Image7" descr=""/>
             <wp:cNvGraphicFramePr>
               <a:graphicFrameLocks xmlns:a="http://schemas.openxmlformats.org/drawingml/2006/main" noChangeAspect="1"/>
             </wp:cNvGraphicFramePr>
@@ -591,13 +674,13 @@
               <a:graphicData uri="http://schemas.openxmlformats.org/drawingml/2006/picture">
                 <pic:pic xmlns:pic="http://schemas.openxmlformats.org/drawingml/2006/picture">
                   <pic:nvPicPr>
-                    <pic:cNvPr id="7" name="Image7" descr=""/>
+                    <pic:cNvPr id="8" name="Image7" descr=""/>
                     <pic:cNvPicPr>
                       <a:picLocks noChangeAspect="1" noChangeArrowheads="1"/>
                     </pic:cNvPicPr>
                   </pic:nvPicPr>
                   <pic:blipFill>
-                    <a:blip r:embed="rId8"/>
+                    <a:blip r:embed="rId9"/>
                     <a:stretch>
                       <a:fillRect/>
                     </a:stretch>

</xml_diff>

<commit_message>
docs(all): some doe updates
</commit_message>
<xml_diff>
--- a/Docs/DataPlot-d3(exp2).docx
+++ b/Docs/DataPlot-d3(exp2).docx
@@ -181,6 +181,39 @@
       <w:r>
         <w:rPr/>
         <w:t>2. Final Test Between-List result (by initial test list number)</w:t>
+      </w:r>
+    </w:p>
+    <w:p>
+      <w:pPr>
+        <w:pStyle w:val="Normal"/>
+        <w:bidi w:val="0"/>
+        <w:jc w:val="left"/>
+        <w:rPr/>
+      </w:pPr>
+      <w:r>
+        <w:rPr/>
+      </w:r>
+    </w:p>
+    <w:p>
+      <w:pPr>
+        <w:pStyle w:val="Normal"/>
+        <w:bidi w:val="0"/>
+        <w:jc w:val="left"/>
+        <w:rPr/>
+      </w:pPr>
+      <w:r>
+        <w:rPr/>
+      </w:r>
+    </w:p>
+    <w:p>
+      <w:pPr>
+        <w:pStyle w:val="Normal"/>
+        <w:bidi w:val="0"/>
+        <w:jc w:val="left"/>
+        <w:rPr/>
+      </w:pPr>
+      <w:r>
+        <w:rPr/>
       </w:r>
     </w:p>
     <w:p>

</xml_diff>

<commit_message>
finetune(model-E3): update ratio and drift study parameters for improved simulation accuracy
- Adjusted ratio_unchanging_to_itself_init from 0.4 to 0.46 to enhance model performance.
- Increased n_driftStudyTest from 9 to 12 to better reflect testing conditions.

These changes aim to refine the simulation parameters for more accurate results in the modeling framework.

Refs #13
</commit_message>
<xml_diff>
--- a/Docs/DataPlot-d3(exp2).docx
+++ b/Docs/DataPlot-d3(exp2).docx
@@ -471,6 +471,52 @@
       </w:pPr>
       <w:r>
         <w:rPr/>
+        <w:drawing>
+          <wp:anchor behindDoc="0" distT="0" distB="0" distL="0" distR="0" simplePos="0" locked="0" layoutInCell="0" allowOverlap="1" relativeHeight="10">
+            <wp:simplePos x="0" y="0"/>
+            <wp:positionH relativeFrom="column">
+              <wp:align>center</wp:align>
+            </wp:positionH>
+            <wp:positionV relativeFrom="paragraph">
+              <wp:posOffset>635</wp:posOffset>
+            </wp:positionV>
+            <wp:extent cx="6332220" cy="2509520"/>
+            <wp:effectExtent l="0" t="0" r="0" b="0"/>
+            <wp:wrapSquare wrapText="largest"/>
+            <wp:docPr id="6" name="Image9" descr=""/>
+            <wp:cNvGraphicFramePr>
+              <a:graphicFrameLocks xmlns:a="http://schemas.openxmlformats.org/drawingml/2006/main" noChangeAspect="1"/>
+            </wp:cNvGraphicFramePr>
+            <a:graphic xmlns:a="http://schemas.openxmlformats.org/drawingml/2006/main">
+              <a:graphicData uri="http://schemas.openxmlformats.org/drawingml/2006/picture">
+                <pic:pic xmlns:pic="http://schemas.openxmlformats.org/drawingml/2006/picture">
+                  <pic:nvPicPr>
+                    <pic:cNvPr id="6" name="Image9" descr=""/>
+                    <pic:cNvPicPr>
+                      <a:picLocks noChangeAspect="1" noChangeArrowheads="1"/>
+                    </pic:cNvPicPr>
+                  </pic:nvPicPr>
+                  <pic:blipFill>
+                    <a:blip r:embed="rId7"/>
+                    <a:stretch>
+                      <a:fillRect/>
+                    </a:stretch>
+                  </pic:blipFill>
+                  <pic:spPr bwMode="auto">
+                    <a:xfrm>
+                      <a:off x="0" y="0"/>
+                      <a:ext cx="6332220" cy="2509520"/>
+                    </a:xfrm>
+                    <a:prstGeom prst="rect">
+                      <a:avLst/>
+                    </a:prstGeom>
+                    <a:noFill/>
+                  </pic:spPr>
+                </pic:pic>
+              </a:graphicData>
+            </a:graphic>
+          </wp:anchor>
+        </w:drawing>
       </w:r>
     </w:p>
     <w:p>
@@ -529,7 +575,7 @@
             <wp:extent cx="6332220" cy="1865630"/>
             <wp:effectExtent l="0" t="0" r="0" b="0"/>
             <wp:wrapSquare wrapText="largest"/>
-            <wp:docPr id="6" name="Image5" descr=""/>
+            <wp:docPr id="7" name="Image5" descr=""/>
             <wp:cNvGraphicFramePr>
               <a:graphicFrameLocks xmlns:a="http://schemas.openxmlformats.org/drawingml/2006/main" noChangeAspect="1"/>
             </wp:cNvGraphicFramePr>
@@ -537,13 +583,13 @@
               <a:graphicData uri="http://schemas.openxmlformats.org/drawingml/2006/picture">
                 <pic:pic xmlns:pic="http://schemas.openxmlformats.org/drawingml/2006/picture">
                   <pic:nvPicPr>
-                    <pic:cNvPr id="6" name="Image5" descr=""/>
+                    <pic:cNvPr id="7" name="Image5" descr=""/>
                     <pic:cNvPicPr>
                       <a:picLocks noChangeAspect="1" noChangeArrowheads="1"/>
                     </pic:cNvPicPr>
                   </pic:nvPicPr>
                   <pic:blipFill>
-                    <a:blip r:embed="rId7"/>
+                    <a:blip r:embed="rId8"/>
                     <a:stretch>
                       <a:fillRect/>
                     </a:stretch>
@@ -609,7 +655,7 @@
             <wp:extent cx="6332220" cy="4845050"/>
             <wp:effectExtent l="0" t="0" r="0" b="0"/>
             <wp:wrapSquare wrapText="largest"/>
-            <wp:docPr id="7" name="Image6" descr=""/>
+            <wp:docPr id="8" name="Image6" descr=""/>
             <wp:cNvGraphicFramePr>
               <a:graphicFrameLocks xmlns:a="http://schemas.openxmlformats.org/drawingml/2006/main" noChangeAspect="1"/>
             </wp:cNvGraphicFramePr>
@@ -617,13 +663,13 @@
               <a:graphicData uri="http://schemas.openxmlformats.org/drawingml/2006/picture">
                 <pic:pic xmlns:pic="http://schemas.openxmlformats.org/drawingml/2006/picture">
                   <pic:nvPicPr>
-                    <pic:cNvPr id="7" name="Image6" descr=""/>
+                    <pic:cNvPr id="8" name="Image6" descr=""/>
                     <pic:cNvPicPr>
                       <a:picLocks noChangeAspect="1" noChangeArrowheads="1"/>
                     </pic:cNvPicPr>
                   </pic:nvPicPr>
                   <pic:blipFill>
-                    <a:blip r:embed="rId8"/>
+                    <a:blip r:embed="rId9"/>
                     <a:stretch>
                       <a:fillRect/>
                     </a:stretch>
@@ -699,7 +745,7 @@
             <wp:extent cx="6332220" cy="2477770"/>
             <wp:effectExtent l="0" t="0" r="0" b="0"/>
             <wp:wrapSquare wrapText="largest"/>
-            <wp:docPr id="8" name="Image7" descr=""/>
+            <wp:docPr id="9" name="Image7" descr=""/>
             <wp:cNvGraphicFramePr>
               <a:graphicFrameLocks xmlns:a="http://schemas.openxmlformats.org/drawingml/2006/main" noChangeAspect="1"/>
             </wp:cNvGraphicFramePr>
@@ -707,13 +753,13 @@
               <a:graphicData uri="http://schemas.openxmlformats.org/drawingml/2006/picture">
                 <pic:pic xmlns:pic="http://schemas.openxmlformats.org/drawingml/2006/picture">
                   <pic:nvPicPr>
-                    <pic:cNvPr id="8" name="Image7" descr=""/>
+                    <pic:cNvPr id="9" name="Image7" descr=""/>
                     <pic:cNvPicPr>
                       <a:picLocks noChangeAspect="1" noChangeArrowheads="1"/>
                     </pic:cNvPicPr>
                   </pic:nvPicPr>
                   <pic:blipFill>
-                    <a:blip r:embed="rId9"/>
+                    <a:blip r:embed="rId10"/>
                     <a:stretch>
                       <a:fillRect/>
                     </a:stretch>

</xml_diff>